<commit_message>
Remove template instructions, add ORCID, sort references alphabetically (APA)
</commit_message>
<xml_diff>
--- a/Bibliometric_Analysis_BISU_Computing_Research_Full_Paper.docx
+++ b/Bibliometric_Analysis_BISU_Computing_Research_Full_Paper.docx
@@ -88,6 +88,7 @@
           <w:i w:val="0"/>
           <w:sz w:val="24"/>
         </w:rPr>
+        <w:t>https://orcid.org/0000-0002-2746-7220</w:t>
       </w:r>
     </w:p>
     <w:p>
@@ -97,7 +98,10 @@
       </w:pPr>
       <w:r>
         <w:rPr>
-          <w:rtl w:val="0"/>
+          <w:rFonts w:ascii="Times New Roman" w:hAnsi="Times New Roman"/>
+          <w:b w:val="0"/>
+          <w:i w:val="0"/>
+          <w:sz w:val="24"/>
         </w:rPr>
       </w:r>
     </w:p>
@@ -108,7 +112,10 @@
       </w:pPr>
       <w:r>
         <w:rPr>
-          <w:rtl w:val="0"/>
+          <w:rFonts w:ascii="Times New Roman" w:hAnsi="Times New Roman"/>
+          <w:b w:val="0"/>
+          <w:i w:val="0"/>
+          <w:sz w:val="24"/>
         </w:rPr>
       </w:r>
     </w:p>
@@ -119,7 +126,10 @@
       </w:pPr>
       <w:r>
         <w:rPr>
-          <w:rtl w:val="0"/>
+          <w:rFonts w:ascii="Times New Roman" w:hAnsi="Times New Roman"/>
+          <w:b w:val="0"/>
+          <w:i w:val="0"/>
+          <w:sz w:val="24"/>
         </w:rPr>
       </w:r>
     </w:p>
@@ -130,7 +140,10 @@
       </w:pPr>
       <w:r>
         <w:rPr>
-          <w:rtl w:val="0"/>
+          <w:rFonts w:ascii="Times New Roman" w:hAnsi="Times New Roman"/>
+          <w:b w:val="0"/>
+          <w:i w:val="0"/>
+          <w:sz w:val="24"/>
         </w:rPr>
       </w:r>
     </w:p>
@@ -141,7 +154,10 @@
       </w:pPr>
       <w:r>
         <w:rPr>
-          <w:rtl w:val="0"/>
+          <w:rFonts w:ascii="Times New Roman" w:hAnsi="Times New Roman"/>
+          <w:b w:val="0"/>
+          <w:i w:val="0"/>
+          <w:sz w:val="24"/>
         </w:rPr>
       </w:r>
     </w:p>
@@ -152,7 +168,10 @@
       </w:pPr>
       <w:r>
         <w:rPr>
-          <w:rtl w:val="0"/>
+          <w:rFonts w:ascii="Times New Roman" w:hAnsi="Times New Roman"/>
+          <w:b w:val="0"/>
+          <w:i w:val="0"/>
+          <w:sz w:val="24"/>
         </w:rPr>
       </w:r>
     </w:p>
@@ -163,7 +182,10 @@
       </w:pPr>
       <w:r>
         <w:rPr>
-          <w:rtl w:val="0"/>
+          <w:rFonts w:ascii="Times New Roman" w:hAnsi="Times New Roman"/>
+          <w:b w:val="0"/>
+          <w:i w:val="0"/>
+          <w:sz w:val="24"/>
         </w:rPr>
       </w:r>
     </w:p>
@@ -174,7 +196,10 @@
       </w:pPr>
       <w:r>
         <w:rPr>
-          <w:rtl w:val="0"/>
+          <w:rFonts w:ascii="Times New Roman" w:hAnsi="Times New Roman"/>
+          <w:b w:val="0"/>
+          <w:i w:val="0"/>
+          <w:sz w:val="24"/>
         </w:rPr>
       </w:r>
     </w:p>
@@ -185,7 +210,10 @@
       </w:pPr>
       <w:r>
         <w:rPr>
-          <w:rtl w:val="0"/>
+          <w:rFonts w:ascii="Times New Roman" w:hAnsi="Times New Roman"/>
+          <w:b w:val="0"/>
+          <w:i w:val="0"/>
+          <w:sz w:val="24"/>
         </w:rPr>
       </w:r>
     </w:p>
@@ -196,7 +224,10 @@
       </w:pPr>
       <w:r>
         <w:rPr>
-          <w:rtl w:val="0"/>
+          <w:rFonts w:ascii="Times New Roman" w:hAnsi="Times New Roman"/>
+          <w:b w:val="0"/>
+          <w:i w:val="0"/>
+          <w:sz w:val="24"/>
         </w:rPr>
       </w:r>
     </w:p>
@@ -207,7 +238,10 @@
       </w:pPr>
       <w:r>
         <w:rPr>
-          <w:rtl w:val="0"/>
+          <w:rFonts w:ascii="Times New Roman" w:hAnsi="Times New Roman"/>
+          <w:b w:val="0"/>
+          <w:i w:val="0"/>
+          <w:sz w:val="24"/>
         </w:rPr>
       </w:r>
     </w:p>
@@ -218,7 +252,10 @@
       </w:pPr>
       <w:r>
         <w:rPr>
-          <w:rtl w:val="0"/>
+          <w:rFonts w:ascii="Times New Roman" w:hAnsi="Times New Roman"/>
+          <w:b w:val="0"/>
+          <w:i w:val="0"/>
+          <w:sz w:val="24"/>
         </w:rPr>
       </w:r>
     </w:p>
@@ -229,7 +266,10 @@
       </w:pPr>
       <w:r>
         <w:rPr>
-          <w:rtl w:val="0"/>
+          <w:rFonts w:ascii="Times New Roman" w:hAnsi="Times New Roman"/>
+          <w:b w:val="0"/>
+          <w:i w:val="0"/>
+          <w:sz w:val="24"/>
         </w:rPr>
       </w:r>
     </w:p>
@@ -240,7 +280,10 @@
       </w:pPr>
       <w:r>
         <w:rPr>
-          <w:rtl w:val="0"/>
+          <w:rFonts w:ascii="Times New Roman" w:hAnsi="Times New Roman"/>
+          <w:b w:val="0"/>
+          <w:i w:val="0"/>
+          <w:sz w:val="24"/>
         </w:rPr>
       </w:r>
     </w:p>
@@ -251,7 +294,10 @@
       </w:pPr>
       <w:r>
         <w:rPr>
-          <w:rtl w:val="0"/>
+          <w:rFonts w:ascii="Times New Roman" w:hAnsi="Times New Roman"/>
+          <w:b w:val="0"/>
+          <w:i w:val="0"/>
+          <w:sz w:val="24"/>
         </w:rPr>
       </w:r>
     </w:p>
@@ -262,7 +308,10 @@
       </w:pPr>
       <w:r>
         <w:rPr>
-          <w:rtl w:val="0"/>
+          <w:rFonts w:ascii="Times New Roman" w:hAnsi="Times New Roman"/>
+          <w:b w:val="0"/>
+          <w:i w:val="0"/>
+          <w:sz w:val="24"/>
         </w:rPr>
       </w:r>
     </w:p>
@@ -273,7 +322,10 @@
       </w:pPr>
       <w:r>
         <w:rPr>
-          <w:rtl w:val="0"/>
+          <w:rFonts w:ascii="Times New Roman" w:hAnsi="Times New Roman"/>
+          <w:b w:val="0"/>
+          <w:i w:val="0"/>
+          <w:sz w:val="24"/>
         </w:rPr>
       </w:r>
     </w:p>
@@ -284,7 +336,10 @@
       </w:pPr>
       <w:r>
         <w:rPr>
-          <w:rtl w:val="0"/>
+          <w:rFonts w:ascii="Times New Roman" w:hAnsi="Times New Roman"/>
+          <w:b w:val="0"/>
+          <w:i w:val="0"/>
+          <w:sz w:val="24"/>
         </w:rPr>
       </w:r>
     </w:p>
@@ -295,7 +350,10 @@
       </w:pPr>
       <w:r>
         <w:rPr>
-          <w:rtl w:val="0"/>
+          <w:rFonts w:ascii="Times New Roman" w:hAnsi="Times New Roman"/>
+          <w:b w:val="0"/>
+          <w:i w:val="0"/>
+          <w:sz w:val="24"/>
         </w:rPr>
       </w:r>
     </w:p>
@@ -306,7 +364,10 @@
       </w:pPr>
       <w:r>
         <w:rPr>
-          <w:rtl w:val="0"/>
+          <w:rFonts w:ascii="Times New Roman" w:hAnsi="Times New Roman"/>
+          <w:b w:val="0"/>
+          <w:i w:val="0"/>
+          <w:sz w:val="24"/>
         </w:rPr>
       </w:r>
     </w:p>
@@ -317,7 +378,10 @@
       </w:pPr>
       <w:r>
         <w:rPr>
-          <w:rtl w:val="0"/>
+          <w:rFonts w:ascii="Times New Roman" w:hAnsi="Times New Roman"/>
+          <w:b w:val="0"/>
+          <w:i w:val="0"/>
+          <w:sz w:val="24"/>
         </w:rPr>
       </w:r>
     </w:p>
@@ -339,7 +403,10 @@
       </w:pPr>
       <w:r>
         <w:rPr>
-          <w:rtl w:val="0"/>
+          <w:rFonts w:ascii="Times New Roman" w:hAnsi="Times New Roman"/>
+          <w:b w:val="0"/>
+          <w:i w:val="0"/>
+          <w:sz w:val="24"/>
         </w:rPr>
       </w:r>
     </w:p>
@@ -360,11 +427,11 @@
       </w:pPr>
       <w:r>
         <w:rPr>
-          <w:rFonts w:ascii="Times New Roman" w:cs="Times New Roman" w:eastAsia="Times New Roman" w:hAnsi="Times New Roman"/>
-          <w:color w:val="000000"/>
-          <w:rtl w:val="0"/>
-        </w:rPr>
-        <w:t xml:space="preserve">HEADING LEVEL 1(TNR12) </w:t>
+          <w:rFonts w:ascii="Times New Roman" w:hAnsi="Times New Roman"/>
+          <w:b w:val="0"/>
+          <w:i w:val="0"/>
+          <w:sz w:val="24"/>
+        </w:rPr>
       </w:r>
     </w:p>
     <w:p>
@@ -373,7 +440,10 @@
       </w:pPr>
       <w:r>
         <w:rPr>
-          <w:rtl w:val="0"/>
+          <w:rFonts w:ascii="Times New Roman" w:hAnsi="Times New Roman"/>
+          <w:b w:val="0"/>
+          <w:i w:val="0"/>
+          <w:sz w:val="24"/>
         </w:rPr>
       </w:r>
     </w:p>
@@ -396,11 +466,11 @@
       </w:pPr>
       <w:r>
         <w:rPr>
-          <w:rFonts w:ascii="Times New Roman" w:cs="Times New Roman" w:eastAsia="Times New Roman" w:hAnsi="Times New Roman"/>
-          <w:color w:val="000000"/>
-          <w:rtl w:val="0"/>
-        </w:rPr>
-        <w:t xml:space="preserve">Use Times New Roman 12 only throughout unless stated otherwise. Do not indent the first line  of paragraph following a heading or sub heading. Use single spacing for main document. Note that  there is only one space between sentences. Use single spacing for main document. Note that there  is only one space between sentences.  </w:t>
+          <w:rFonts w:ascii="Times New Roman" w:hAnsi="Times New Roman"/>
+          <w:b w:val="0"/>
+          <w:i w:val="0"/>
+          <w:sz w:val="24"/>
+        </w:rPr>
       </w:r>
     </w:p>
     <w:p>
@@ -421,11 +491,11 @@
       </w:pPr>
       <w:r>
         <w:rPr>
-          <w:rFonts w:ascii="Times New Roman" w:cs="Times New Roman" w:eastAsia="Times New Roman" w:hAnsi="Times New Roman"/>
-          <w:color w:val="000000"/>
-          <w:rtl w:val="0"/>
-        </w:rPr>
-        <w:t xml:space="preserve">Indent 5 spaces subsequent paragraphs. Indent 5 spaces subsequent paragraphs. Indent 5  spaces subsequent paragraphs. Indent 5 spaces subsequent paragraphs:</w:t>
+          <w:rFonts w:ascii="Times New Roman" w:hAnsi="Times New Roman"/>
+          <w:b w:val="0"/>
+          <w:i w:val="0"/>
+          <w:sz w:val="24"/>
+        </w:rPr>
       </w:r>
     </w:p>
     <w:p>
@@ -434,7 +504,10 @@
       </w:pPr>
       <w:r>
         <w:rPr>
-          <w:rtl w:val="0"/>
+          <w:rFonts w:ascii="Times New Roman" w:hAnsi="Times New Roman"/>
+          <w:b w:val="0"/>
+          <w:i w:val="0"/>
+          <w:sz w:val="24"/>
         </w:rPr>
       </w:r>
     </w:p>
@@ -456,17 +529,10 @@
       </w:pPr>
       <w:r>
         <w:rPr>
-          <w:rFonts w:ascii="Times New Roman" w:cs="Times New Roman" w:eastAsia="Times New Roman" w:hAnsi="Times New Roman"/>
-          <w:color w:val="000000"/>
-          <w:sz w:val="18"/>
-          <w:szCs w:val="18"/>
-          <w:rtl w:val="0"/>
-        </w:rPr>
-        <w:t xml:space="preserve">When quotations run into more than 40 words indent as shown here. Use Times New Roman 9 as font size. When quotations run into more than 40 words indent as shown here use Times New Roman 9 as font size. When quotations run into more than 40 words indent as shown here use Times New Roman 9 as font size. </w:t>
-      </w:r>
-      <w:r>
-        <w:rPr>
-          <w:rtl w:val="0"/>
+          <w:rFonts w:ascii="Times New Roman" w:hAnsi="Times New Roman"/>
+          <w:b w:val="0"/>
+          <w:i w:val="0"/>
+          <w:sz w:val="24"/>
         </w:rPr>
       </w:r>
     </w:p>
@@ -476,7 +542,10 @@
       </w:pPr>
       <w:r>
         <w:rPr>
-          <w:rtl w:val="0"/>
+          <w:rFonts w:ascii="Times New Roman" w:hAnsi="Times New Roman"/>
+          <w:b w:val="0"/>
+          <w:i w:val="0"/>
+          <w:sz w:val="24"/>
         </w:rPr>
       </w:r>
     </w:p>
@@ -498,29 +567,11 @@
       </w:pPr>
       <w:r>
         <w:rPr>
-          <w:rFonts w:ascii="Times New Roman" w:cs="Times New Roman" w:eastAsia="Times New Roman" w:hAnsi="Times New Roman"/>
-          <w:color w:val="000000"/>
-          <w:rtl w:val="0"/>
-        </w:rPr>
-        <w:t xml:space="preserve">Do not use numbers or alphabets in headings and sub-headings (</w:t>
-      </w:r>
-      <w:r>
-        <w:rPr>
-          <w:rFonts w:ascii="Times New Roman" w:cs="Times New Roman" w:eastAsia="Times New Roman" w:hAnsi="Times New Roman"/>
-          <w:i w:val="1"/>
-          <w:iCs w:val="1"/>
-          <w:color w:val="000000"/>
-          <w:rtl w:val="0"/>
-        </w:rPr>
-        <w:t xml:space="preserve">Example A. Introduction 1. Body)</w:t>
-      </w:r>
-      <w:r>
-        <w:rPr>
-          <w:rFonts w:ascii="Times New Roman" w:cs="Times New Roman" w:eastAsia="Times New Roman" w:hAnsi="Times New Roman"/>
-          <w:color w:val="000000"/>
-          <w:rtl w:val="0"/>
-        </w:rPr>
-        <w:t xml:space="preserve">.  Use the following style for headings and sub-headings </w:t>
+          <w:rFonts w:ascii="Times New Roman" w:hAnsi="Times New Roman"/>
+          <w:b w:val="0"/>
+          <w:i w:val="0"/>
+          <w:sz w:val="24"/>
+        </w:rPr>
       </w:r>
     </w:p>
     <w:p>
@@ -529,7 +580,10 @@
       </w:pPr>
       <w:r>
         <w:rPr>
-          <w:rtl w:val="0"/>
+          <w:rFonts w:ascii="Times New Roman" w:hAnsi="Times New Roman"/>
+          <w:b w:val="0"/>
+          <w:i w:val="0"/>
+          <w:sz w:val="24"/>
         </w:rPr>
       </w:r>
     </w:p>
@@ -551,11 +605,11 @@
       </w:pPr>
       <w:r>
         <w:rPr>
-          <w:rFonts w:ascii="Times New Roman" w:cs="Times New Roman" w:eastAsia="Times New Roman" w:hAnsi="Times New Roman"/>
-          <w:color w:val="000000"/>
-          <w:rtl w:val="0"/>
-        </w:rPr>
-        <w:t xml:space="preserve">USE THIS STYLE FOR SUB HEADINGS (TNR ITALIZED 12) </w:t>
+          <w:rFonts w:ascii="Times New Roman" w:hAnsi="Times New Roman"/>
+          <w:b w:val="0"/>
+          <w:i w:val="0"/>
+          <w:sz w:val="24"/>
+        </w:rPr>
       </w:r>
     </w:p>
     <w:p>
@@ -564,7 +618,10 @@
       </w:pPr>
       <w:r>
         <w:rPr>
-          <w:rtl w:val="0"/>
+          <w:rFonts w:ascii="Times New Roman" w:hAnsi="Times New Roman"/>
+          <w:b w:val="0"/>
+          <w:i w:val="0"/>
+          <w:sz w:val="24"/>
         </w:rPr>
       </w:r>
     </w:p>
@@ -586,17 +643,10 @@
       </w:pPr>
       <w:r>
         <w:rPr>
-          <w:rFonts w:ascii="Times New Roman" w:cs="Times New Roman" w:eastAsia="Times New Roman" w:hAnsi="Times New Roman"/>
-          <w:b w:val="1"/>
-          <w:bCs w:val="1"/>
-          <w:color w:val="000000"/>
-          <w:rtl w:val="0"/>
-        </w:rPr>
-        <w:t xml:space="preserve">Including tables and figures in manuscript  </w:t>
-      </w:r>
-      <w:r>
-        <w:rPr>
-          <w:rtl w:val="0"/>
+          <w:rFonts w:ascii="Times New Roman" w:hAnsi="Times New Roman"/>
+          <w:b w:val="0"/>
+          <w:i w:val="0"/>
+          <w:sz w:val="24"/>
         </w:rPr>
       </w:r>
     </w:p>
@@ -618,47 +668,11 @@
       </w:pPr>
       <w:r>
         <w:rPr>
-          <w:rFonts w:ascii="Times New Roman" w:cs="Times New Roman" w:eastAsia="Times New Roman" w:hAnsi="Times New Roman"/>
-          <w:color w:val="000000"/>
-          <w:rtl w:val="0"/>
-        </w:rPr>
-        <w:t xml:space="preserve">[Use Times New Roman font size 7 for </w:t>
-      </w:r>
-      <w:r>
-        <w:rPr>
-          <w:rFonts w:ascii="Times New Roman" w:cs="Times New Roman" w:eastAsia="Times New Roman" w:hAnsi="Times New Roman"/>
-          <w:b w:val="1"/>
-          <w:bCs w:val="1"/>
-          <w:color w:val="000000"/>
-          <w:rtl w:val="0"/>
-        </w:rPr>
-        <w:t xml:space="preserve">- </w:t>
-      </w:r>
-      <w:r>
-        <w:rPr>
-          <w:rFonts w:ascii="Times New Roman" w:cs="Times New Roman" w:eastAsia="Times New Roman" w:hAnsi="Times New Roman"/>
-          <w:color w:val="000000"/>
-          <w:rtl w:val="0"/>
-        </w:rPr>
-        <w:t xml:space="preserve">TABLE 1, FIGURE 1. Use Times New Roman font size 9 for  labels </w:t>
-      </w:r>
-      <w:r>
-        <w:rPr>
-          <w:rFonts w:ascii="Times New Roman" w:cs="Times New Roman" w:eastAsia="Times New Roman" w:hAnsi="Times New Roman"/>
-          <w:b w:val="1"/>
-          <w:bCs w:val="1"/>
-          <w:color w:val="000000"/>
-          <w:rtl w:val="0"/>
-        </w:rPr>
-        <w:t xml:space="preserve">- </w:t>
-      </w:r>
-      <w:r>
-        <w:rPr>
-          <w:rFonts w:ascii="Times New Roman" w:cs="Times New Roman" w:eastAsia="Times New Roman" w:hAnsi="Times New Roman"/>
-          <w:color w:val="000000"/>
-          <w:rtl w:val="0"/>
-        </w:rPr>
-        <w:t xml:space="preserve">Simple example of a table] </w:t>
+          <w:rFonts w:ascii="Times New Roman" w:hAnsi="Times New Roman"/>
+          <w:b w:val="0"/>
+          <w:i w:val="0"/>
+          <w:sz w:val="24"/>
+        </w:rPr>
       </w:r>
     </w:p>
     <w:p>
@@ -667,7 +681,10 @@
       </w:pPr>
       <w:r>
         <w:rPr>
-          <w:rtl w:val="0"/>
+          <w:rFonts w:ascii="Times New Roman" w:hAnsi="Times New Roman"/>
+          <w:b w:val="0"/>
+          <w:i w:val="0"/>
+          <w:sz w:val="24"/>
         </w:rPr>
       </w:r>
     </w:p>
@@ -689,27 +706,10 @@
       </w:pPr>
       <w:r>
         <w:rPr>
-          <w:rFonts w:ascii="Times New Roman" w:cs="Times New Roman" w:eastAsia="Times New Roman" w:hAnsi="Times New Roman"/>
-          <w:color w:val="000000"/>
-          <w:sz w:val="13"/>
-          <w:szCs w:val="13"/>
-          <w:rtl w:val="0"/>
-        </w:rPr>
-        <w:t xml:space="preserve">TABLE 1. </w:t>
-      </w:r>
-      <w:r>
-        <w:rPr>
-          <w:rFonts w:ascii="Times New Roman" w:cs="Times New Roman" w:eastAsia="Times New Roman" w:hAnsi="Times New Roman"/>
-          <w:color w:val="000000"/>
-          <w:sz w:val="18"/>
-          <w:szCs w:val="18"/>
-          <w:rtl w:val="0"/>
-        </w:rPr>
-        <w:t xml:space="preserve">Simple example of a table</w:t>
-      </w:r>
-      <w:r>
-        <w:rPr>
-          <w:rtl w:val="0"/>
+          <w:rFonts w:ascii="Times New Roman" w:hAnsi="Times New Roman"/>
+          <w:b w:val="0"/>
+          <w:i w:val="0"/>
+          <w:sz w:val="24"/>
         </w:rPr>
       </w:r>
     </w:p>
@@ -719,7 +719,10 @@
       </w:pPr>
       <w:r>
         <w:rPr>
-          <w:rtl w:val="0"/>
+          <w:rFonts w:ascii="Times New Roman" w:hAnsi="Times New Roman"/>
+          <w:b w:val="0"/>
+          <w:i w:val="0"/>
+          <w:sz w:val="24"/>
         </w:rPr>
       </w:r>
     </w:p>
@@ -729,7 +732,10 @@
       </w:pPr>
       <w:r>
         <w:rPr>
-          <w:rtl w:val="0"/>
+          <w:rFonts w:ascii="Times New Roman" w:hAnsi="Times New Roman"/>
+          <w:b w:val="0"/>
+          <w:i w:val="0"/>
+          <w:sz w:val="24"/>
         </w:rPr>
       </w:r>
     </w:p>
@@ -751,57 +757,10 @@
       </w:pPr>
       <w:r>
         <w:rPr>
-          <w:rFonts w:ascii="Times New Roman" w:cs="Times New Roman" w:eastAsia="Times New Roman" w:hAnsi="Times New Roman"/>
-          <w:color w:val="000000"/>
-          <w:sz w:val="18"/>
-          <w:szCs w:val="18"/>
-          <w:rtl w:val="0"/>
-        </w:rPr>
-        <w:t xml:space="preserve">   </w:t>
-      </w:r>
-      <w:r>
-        <w:rPr>
-          <w:rFonts w:ascii="Times New Roman" w:cs="Times New Roman" w:eastAsia="Times New Roman" w:hAnsi="Times New Roman"/>
-          <w:color w:val="000000"/>
-          <w:sz w:val="18"/>
-          <w:szCs w:val="18"/>
-        </w:rPr>
-        <w:drawing>
-          <wp:inline distB="0" distT="0" distL="0" distR="0">
-            <wp:extent cx="3378200" cy="1727200"/>
-            <wp:effectExtent b="0" l="0" r="0" t="0"/>
-            <wp:docPr descr="A diagram of a diagram&#10;&#10;Description automatically generated" id="2034569916" name="image3.png"/>
-            <a:graphic>
-              <a:graphicData uri="http://schemas.openxmlformats.org/drawingml/2006/picture">
-                <pic:pic>
-                  <pic:nvPicPr>
-                    <pic:cNvPr descr="A diagram of a diagram&#10;&#10;Description automatically generated" id="0" name="image3.png"/>
-                    <pic:cNvPicPr preferRelativeResize="0"/>
-                  </pic:nvPicPr>
-                  <pic:blipFill>
-                    <a:blip r:embed="rId7"/>
-                    <a:srcRect b="0" l="0" r="0" t="0"/>
-                    <a:stretch>
-                      <a:fillRect/>
-                    </a:stretch>
-                  </pic:blipFill>
-                  <pic:spPr>
-                    <a:xfrm>
-                      <a:off x="0" y="0"/>
-                      <a:ext cx="3378200" cy="1727200"/>
-                    </a:xfrm>
-                    <a:prstGeom prst="rect"/>
-                    <a:ln/>
-                  </pic:spPr>
-                </pic:pic>
-              </a:graphicData>
-            </a:graphic>
-          </wp:inline>
-        </w:drawing>
-      </w:r>
-      <w:r>
-        <w:rPr>
-          <w:rtl w:val="0"/>
+          <w:rFonts w:ascii="Times New Roman" w:hAnsi="Times New Roman"/>
+          <w:b w:val="0"/>
+          <w:i w:val="0"/>
+          <w:sz w:val="24"/>
         </w:rPr>
       </w:r>
     </w:p>
@@ -811,7 +770,10 @@
       </w:pPr>
       <w:r>
         <w:rPr>
-          <w:rtl w:val="0"/>
+          <w:rFonts w:ascii="Times New Roman" w:hAnsi="Times New Roman"/>
+          <w:b w:val="0"/>
+          <w:i w:val="0"/>
+          <w:sz w:val="24"/>
         </w:rPr>
       </w:r>
     </w:p>
@@ -833,39 +795,10 @@
       </w:pPr>
       <w:r>
         <w:rPr>
-          <w:rFonts w:ascii="Times New Roman" w:cs="Times New Roman" w:eastAsia="Times New Roman" w:hAnsi="Times New Roman"/>
-          <w:color w:val="000000"/>
-          <w:sz w:val="13"/>
-          <w:szCs w:val="13"/>
-          <w:rtl w:val="0"/>
-        </w:rPr>
-        <w:t xml:space="preserve">FIGURE 1</w:t>
-      </w:r>
-      <w:r>
-        <w:rPr>
-          <w:rFonts w:ascii="Garamond" w:cs="Garamond" w:eastAsia="Garamond" w:hAnsi="Garamond"/>
-          <w:i w:val="1"/>
-          <w:iCs w:val="1"/>
-          <w:color w:val="000000"/>
-          <w:sz w:val="18"/>
-          <w:szCs w:val="18"/>
-          <w:rtl w:val="0"/>
-        </w:rPr>
-        <w:t xml:space="preserve">. </w:t>
-      </w:r>
-      <w:r>
-        <w:rPr>
-          <w:rFonts w:ascii="Times New Roman" w:cs="Times New Roman" w:eastAsia="Times New Roman" w:hAnsi="Times New Roman"/>
-          <w:color w:val="000000"/>
-          <w:sz w:val="18"/>
-          <w:szCs w:val="18"/>
-          <w:rtl w:val="0"/>
-        </w:rPr>
-        <w:t xml:space="preserve">This is an example of a figure</w:t>
-      </w:r>
-      <w:r>
-        <w:rPr>
-          <w:rtl w:val="0"/>
+          <w:rFonts w:ascii="Times New Roman" w:hAnsi="Times New Roman"/>
+          <w:b w:val="0"/>
+          <w:i w:val="0"/>
+          <w:sz w:val="24"/>
         </w:rPr>
       </w:r>
     </w:p>
@@ -875,7 +808,10 @@
       </w:pPr>
       <w:r>
         <w:rPr>
-          <w:rtl w:val="0"/>
+          <w:rFonts w:ascii="Times New Roman" w:hAnsi="Times New Roman"/>
+          <w:b w:val="0"/>
+          <w:i w:val="0"/>
+          <w:sz w:val="24"/>
         </w:rPr>
       </w:r>
     </w:p>
@@ -897,7 +833,10 @@
       </w:pPr>
       <w:r>
         <w:rPr>
-          <w:rtl w:val="0"/>
+          <w:rFonts w:ascii="Times New Roman" w:hAnsi="Times New Roman"/>
+          <w:b w:val="0"/>
+          <w:i w:val="0"/>
+          <w:sz w:val="24"/>
         </w:rPr>
       </w:r>
     </w:p>
@@ -908,22 +847,28 @@
       </w:pPr>
       <w:r>
         <w:rPr>
-          <w:rtl w:val="0"/>
-        </w:rPr>
-      </w:r>
-    </w:p>
-    <w:p>
-      <w:pPr>
-        <w:spacing w:after="0" w:line="240" w:lineRule="auto"/>
-        <w:rPr>
-          <w:rFonts w:ascii="Times New Roman" w:cs="Times New Roman" w:eastAsia="Times New Roman" w:hAnsi="Times New Roman"/>
-          <w:b w:val="1"/>
-          <w:bCs w:val="1"/>
-        </w:rPr>
-      </w:pPr>
-      <w:r>
-        <w:rPr>
-          <w:rtl w:val="0"/>
+          <w:rFonts w:ascii="Times New Roman" w:hAnsi="Times New Roman"/>
+          <w:b w:val="0"/>
+          <w:i w:val="0"/>
+          <w:sz w:val="24"/>
+        </w:rPr>
+      </w:r>
+    </w:p>
+    <w:p>
+      <w:pPr>
+        <w:spacing w:after="0" w:line="240" w:lineRule="auto"/>
+        <w:rPr>
+          <w:rFonts w:ascii="Times New Roman" w:cs="Times New Roman" w:eastAsia="Times New Roman" w:hAnsi="Times New Roman"/>
+          <w:b w:val="1"/>
+          <w:bCs w:val="1"/>
+        </w:rPr>
+      </w:pPr>
+      <w:r>
+        <w:rPr>
+          <w:rFonts w:ascii="Times New Roman" w:hAnsi="Times New Roman"/>
+          <w:b w:val="0"/>
+          <w:i w:val="0"/>
+          <w:sz w:val="24"/>
         </w:rPr>
       </w:r>
     </w:p>
@@ -1997,7 +1942,7 @@
         <w:drawing>
           <wp:inline>
             <wp:extent cx="4572000" cy="2657634"/>
-            <wp:docPr id="2034569917" name="Picture 2034569917"/>
+            <wp:docPr id="1" name="Picture 1"/>
             <wp:cNvGraphicFramePr>
               <a:graphicFrameLocks noChangeAspect="1"/>
             </wp:cNvGraphicFramePr>
@@ -2079,7 +2024,7 @@
         <w:drawing>
           <wp:inline>
             <wp:extent cx="4572000" cy="2309058"/>
-            <wp:docPr id="2034569918" name="Picture 2034569918"/>
+            <wp:docPr id="2" name="Picture 2"/>
             <wp:cNvGraphicFramePr>
               <a:graphicFrameLocks noChangeAspect="1"/>
             </wp:cNvGraphicFramePr>
@@ -2161,7 +2106,7 @@
         <w:drawing>
           <wp:inline>
             <wp:extent cx="4572000" cy="3862281"/>
-            <wp:docPr id="2034569919" name="Picture 2034569919"/>
+            <wp:docPr id="3" name="Picture 3"/>
             <wp:cNvGraphicFramePr>
               <a:graphicFrameLocks noChangeAspect="1"/>
             </wp:cNvGraphicFramePr>
@@ -2243,7 +2188,7 @@
         <w:drawing>
           <wp:inline>
             <wp:extent cx="4572000" cy="2134609"/>
-            <wp:docPr id="2034569920" name="Picture 2034569920"/>
+            <wp:docPr id="4" name="Picture 4"/>
             <wp:cNvGraphicFramePr>
               <a:graphicFrameLocks noChangeAspect="1"/>
             </wp:cNvGraphicFramePr>
@@ -2325,7 +2270,7 @@
         <w:drawing>
           <wp:inline>
             <wp:extent cx="4572000" cy="3115626"/>
-            <wp:docPr id="2034569921" name="Picture 2034569921"/>
+            <wp:docPr id="5" name="Picture 5"/>
             <wp:cNvGraphicFramePr>
               <a:graphicFrameLocks noChangeAspect="1"/>
             </wp:cNvGraphicFramePr>
@@ -2407,7 +2352,7 @@
         <w:drawing>
           <wp:inline>
             <wp:extent cx="4572000" cy="4746587"/>
-            <wp:docPr id="2034569922" name="Picture 2034569922"/>
+            <wp:docPr id="6" name="Picture 6"/>
             <wp:cNvGraphicFramePr>
               <a:graphicFrameLocks noChangeAspect="1"/>
             </wp:cNvGraphicFramePr>
@@ -2489,7 +2434,7 @@
         <w:drawing>
           <wp:inline>
             <wp:extent cx="4572000" cy="1953621"/>
-            <wp:docPr id="2034569923" name="Picture 2034569923"/>
+            <wp:docPr id="7" name="Picture 7"/>
             <wp:cNvGraphicFramePr>
               <a:graphicFrameLocks noChangeAspect="1"/>
             </wp:cNvGraphicFramePr>
@@ -2571,7 +2516,7 @@
         <w:drawing>
           <wp:inline>
             <wp:extent cx="4572000" cy="2325814"/>
-            <wp:docPr id="2034569924" name="Picture 2034569924"/>
+            <wp:docPr id="8" name="Picture 8"/>
             <wp:cNvGraphicFramePr>
               <a:graphicFrameLocks noChangeAspect="1"/>
             </wp:cNvGraphicFramePr>
@@ -2653,7 +2598,7 @@
         <w:drawing>
           <wp:inline>
             <wp:extent cx="4572000" cy="2484481"/>
-            <wp:docPr id="2034569925" name="Picture 2034569925"/>
+            <wp:docPr id="9" name="Picture 9"/>
             <wp:cNvGraphicFramePr>
               <a:graphicFrameLocks noChangeAspect="1"/>
             </wp:cNvGraphicFramePr>
@@ -2735,7 +2680,7 @@
         <w:drawing>
           <wp:inline>
             <wp:extent cx="4572000" cy="2484481"/>
-            <wp:docPr id="2034569926" name="Picture 2034569926"/>
+            <wp:docPr id="10" name="Picture 10"/>
             <wp:cNvGraphicFramePr>
               <a:graphicFrameLocks noChangeAspect="1"/>
             </wp:cNvGraphicFramePr>
@@ -2817,7 +2762,7 @@
         <w:drawing>
           <wp:inline>
             <wp:extent cx="4572000" cy="1712666"/>
-            <wp:docPr id="2034569927" name="Picture 2034569927"/>
+            <wp:docPr id="11" name="Picture 11"/>
             <wp:cNvGraphicFramePr>
               <a:graphicFrameLocks noChangeAspect="1"/>
             </wp:cNvGraphicFramePr>
@@ -2899,7 +2844,7 @@
         <w:drawing>
           <wp:inline>
             <wp:extent cx="4572000" cy="2682240"/>
-            <wp:docPr id="2034569928" name="Picture 2034569928"/>
+            <wp:docPr id="12" name="Picture 12"/>
             <wp:cNvGraphicFramePr>
               <a:graphicFrameLocks noChangeAspect="1"/>
             </wp:cNvGraphicFramePr>
@@ -2981,7 +2926,7 @@
         <w:drawing>
           <wp:inline>
             <wp:extent cx="4572000" cy="2539597"/>
-            <wp:docPr id="2034569929" name="Picture 2034569929"/>
+            <wp:docPr id="13" name="Picture 13"/>
             <wp:cNvGraphicFramePr>
               <a:graphicFrameLocks noChangeAspect="1"/>
             </wp:cNvGraphicFramePr>
@@ -3367,7 +3312,7 @@
           <w:i w:val="0"/>
           <w:sz w:val="24"/>
         </w:rPr>
-        <w:t>Hendricks, G., Tkaczyk, D., Lin, J., &amp; Feeney, P. (2020). Crossref: The sustainable source of community-owned scholarly metadata. Quantitative Science Studies, 1(1), 414-427. https://doi.org/10.1162/qss_a_00022</w:t>
+        <w:t>Aria, M., Le, T., Cuccurullo, C., Belfiore, A., &amp; Choe, J. (2024). openalexR: An R-Tool for collecting bibliometric data from OpenAlex. The R Journal, 16(2), 167-180. https://doi.org/10.32614/rj-2023-089</w:t>
       </w:r>
     </w:p>
     <w:p>
@@ -3388,7 +3333,7 @@
           <w:i w:val="0"/>
           <w:sz w:val="24"/>
         </w:rPr>
-        <w:t>Velez-Estevez, A., Pérez, I. J., García-Sánchez, P., Moral-Munoz, J. A., &amp; Cobo, M. (2023). New trends in bibliometric APIs: A comparative analysis. Information Processing &amp; Management, 60(4), 103385. https://doi.org/10.1016/j.ipm.2023.103385</w:t>
+        <w:t>Baas, J., Schotten, M., Plume, A., Côté, G., &amp; Karimi, R. (2020). Scopus as a curated, high-quality bibliometric data source for academic research in quantitative science studies. Quantitative Science Studies, 1(1), 377-386. https://doi.org/10.1162/qss_a_00019</w:t>
       </w:r>
     </w:p>
     <w:p>
@@ -3409,7 +3354,7 @@
           <w:i w:val="0"/>
           <w:sz w:val="24"/>
         </w:rPr>
-        <w:t>Baas, J., Schotten, M., Plume, A., Côté, G., &amp; Karimi, R. (2020). Scopus as a curated, high-quality bibliometric data source for academic research in quantitative science studies. Quantitative Science Studies, 1(1), 377-386. https://doi.org/10.1162/qss_a_00019</w:t>
+        <w:t>Du, Q., Zhao, R., Wan, Q., Li, S., Li, H., Wang, D., Ho, C. W., Dai, Z., Chen, Y., &amp; Shan, D. (2024). Protocol for conducting bibliometric analysis in biomedicine and related research using CiteSpace and VOSviewer software. STAR Protocols, 5(3), 103269. https://doi.org/10.1016/j.xpro.2024.103269</w:t>
       </w:r>
     </w:p>
     <w:p>
@@ -3451,7 +3396,7 @@
           <w:i w:val="0"/>
           <w:sz w:val="24"/>
         </w:rPr>
-        <w:t>Aria, M., Le, T., Cuccurullo, C., Belfiore, A., &amp; Choe, J. (2024). openalexR: An R-Tool for collecting bibliometric data from OpenAlex. The R Journal, 16(2), 167-180. https://doi.org/10.32614/rj-2023-089</w:t>
+        <w:t>Hendricks, G., Tkaczyk, D., Lin, J., &amp; Feeney, P. (2020). Crossref: The sustainable source of community-owned scholarly metadata. Quantitative Science Studies, 1(1), 414-427. https://doi.org/10.1162/qss_a_00022</w:t>
       </w:r>
     </w:p>
     <w:p>
@@ -3493,7 +3438,7 @@
           <w:i w:val="0"/>
           <w:sz w:val="24"/>
         </w:rPr>
-        <w:t>Ricardo, V. A., Rifai, A. I., Savitri, A., &amp; Prasetijo, J. (2024). A bibliometric analysis of drinking water distribution in coastal areas using VOSViewer. Asian Journal of Social and Humanities, 2(8), 335. https://doi.org/10.59888/ajosh.v2i8.335</w:t>
+        <w:t>Kumpulainen, M., &amp; Seppänen, M. (2022). Combining Web of Science and Scopus datasets in citation-based literature study. Scientometrics, 127, 5613-5631. https://doi.org/10.1007/s11192-022-04475-7</w:t>
       </w:r>
     </w:p>
     <w:p>
@@ -3535,7 +3480,7 @@
           <w:i w:val="0"/>
           <w:sz w:val="24"/>
         </w:rPr>
-        <w:t>Kumpulainen, M., &amp; Seppänen, M. (2022). Combining Web of Science and Scopus datasets in citation-based literature study. Scientometrics, 127, 5613-5631. https://doi.org/10.1007/s11192-022-04475-7</w:t>
+        <w:t>Nikolić, D., Ivanović, D., &amp; Ivanović, L. (2024). An open-source tool for merging data from multiple citation databases. Scientometrics, 129, 6767-6790. https://doi.org/10.1007/s11192-024-05076-2</w:t>
       </w:r>
     </w:p>
     <w:p>
@@ -3556,7 +3501,7 @@
           <w:i w:val="0"/>
           <w:sz w:val="24"/>
         </w:rPr>
-        <w:t>Nikolić, D., Ivanović, D., &amp; Ivanović, L. (2024). An open-source tool for merging data from multiple citation databases. Scientometrics, 129, 6767-6790. https://doi.org/10.1007/s11192-024-05076-2</w:t>
+        <w:t>Nowakowska, M. (2025). A comprehensive approach to preprocessing data for bibliometric analysis. Scientometrics, 130, 1-35. https://doi.org/10.1007/s11192-025-05415-x</w:t>
       </w:r>
     </w:p>
     <w:p>
@@ -3577,7 +3522,7 @@
           <w:i w:val="0"/>
           <w:sz w:val="24"/>
         </w:rPr>
-        <w:t>Nowakowska, M. (2025). A comprehensive approach to preprocessing data for bibliometric analysis. Scientometrics, 130, 1-35. https://doi.org/10.1007/s11192-025-05415-x</w:t>
+        <w:t>Ricardo, V. A., Rifai, A. I., Savitri, A., &amp; Prasetijo, J. (2024). A bibliometric analysis of drinking water distribution in coastal areas using VOSViewer. Asian Journal of Social and Humanities, 2(8), 335. https://doi.org/10.59888/ajosh.v2i8.335</w:t>
       </w:r>
     </w:p>
     <w:p>
@@ -3598,7 +3543,7 @@
           <w:i w:val="0"/>
           <w:sz w:val="24"/>
         </w:rPr>
-        <w:t>Du, Q., Zhao, R., Wan, Q., Li, S., Li, H., Wang, D., Ho, C. W., Dai, Z., Chen, Y., &amp; Shan, D. (2024). Protocol for conducting bibliometric analysis in biomedicine and related research using CiteSpace and VOSviewer software. STAR Protocols, 5(3), 103269. https://doi.org/10.1016/j.xpro.2024.103269</w:t>
+        <w:t>Velez-Estevez, A., Pérez, I. J., García-Sánchez, P., Moral-Munoz, J. A., &amp; Cobo, M. (2023). New trends in bibliometric APIs: A comparative analysis. Information Processing &amp; Management, 60(4), 103385. https://doi.org/10.1016/j.ipm.2023.103385</w:t>
       </w:r>
     </w:p>
     <w:p>

</xml_diff>